<commit_message>
Fase A2: perbaikan QA ekspor (15 butir)
- ID sesi memakai tanggal lokal; konsep remedial dideduplikasi; batas
  kategori capaian tanpa celah dan teks aturan = kode.
- .xlsx: A4 lanskap, muat lebar, judul berulang; hitungan 0, capaian persen,
  tanggal Excel asli; kolom teks Uraian/Rubrik dibungkus; label (a)/(b).
- .docx: footer ID sesi + Halaman X dari Y; tabel opsi/rubrik/koreksi tidak
  terbelah; lebar kolom minimum; heading tidak melompat; skor dikoreksi
  bertanda * dengan alasan koreksi.
- Fallback .doc: page break dan paragraf gaya Word, meta charset untuk Word.
- Aturan konsistensi 6 (rujukan kriteria kasus wajib menyebut bagian);
  demo pack dan contoh skema diperbarui; CONTRACT.md dan CHANGELOG.md.
- Tes: 67 kasus PASS di selftest (suite baru Ekspor (QA A2)); contoh di
  tests/output/ dibuka ulang di Word/Excel. Keputusan D-51..D-57.

Co-Authored-By: Claude Opus 5.5 <noreply@anthropic.com>
</commit_message>
<xml_diff>
--- a/tests/output/lembar-belajar-demo.docx
+++ b/tests/output/lembar-belajar-demo.docx
@@ -43,13 +43,16 @@
     </w:p>
     <w:p>
       <w:pPr>
-        <w:pStyle w:val="Heading3"/>
+        <w:pStyle w:val="Heading2"/>
       </w:pPr>
       <w:r>
         <w:t xml:space="preserve">Soal 1 · Pilihan ganda · DEMO-MCQ-001</w:t>
       </w:r>
     </w:p>
     <w:p>
+      <w:pPr>
+        <w:keepNext/>
+      </w:pPr>
       <w:r>
         <w:t xml:space="preserve">[DEMO] Kekuatan kompetitif manakah yang paling meningkat ketika biaya beralih (switching cost) pelanggan menjadi sangat rendah?</w:t>
       </w:r>
@@ -76,6 +79,7 @@
       </w:tblGrid>
       <w:tr>
         <w:trPr>
+          <w:cantSplit/>
           <w:tblHeader/>
         </w:trPr>
         <w:tc>
@@ -85,12 +89,15 @@
           </w:tcPr>
           <w:p>
             <w:pPr>
+              <w:keepNext/>
               <w:spacing w:after="0"/>
             </w:pPr>
             <w:r>
               <w:rPr>
                 <w:b/>
                 <w:bCs/>
+                <w:sz w:val="19"/>
+                <w:szCs w:val="19"/>
               </w:rPr>
               <w:t xml:space="preserve">Opsi</w:t>
             </w:r>
@@ -103,12 +110,15 @@
           </w:tcPr>
           <w:p>
             <w:pPr>
+              <w:keepNext/>
               <w:spacing w:after="0"/>
             </w:pPr>
             <w:r>
               <w:rPr>
                 <w:b/>
                 <w:bCs/>
+                <w:sz w:val="19"/>
+                <w:szCs w:val="19"/>
               </w:rPr>
               <w:t xml:space="preserve">Teks</w:t>
             </w:r>
@@ -121,12 +131,15 @@
           </w:tcPr>
           <w:p>
             <w:pPr>
+              <w:keepNext/>
               <w:spacing w:after="0"/>
             </w:pPr>
             <w:r>
               <w:rPr>
                 <w:b/>
                 <w:bCs/>
+                <w:sz w:val="19"/>
+                <w:szCs w:val="19"/>
               </w:rPr>
               <w:t xml:space="preserve">Keterangan</w:t>
             </w:r>
@@ -143,9 +156,14 @@
           </w:tcPr>
           <w:p>
             <w:pPr>
-              <w:spacing w:after="0"/>
-            </w:pPr>
-            <w:r>
+              <w:keepNext/>
+              <w:spacing w:after="0"/>
+            </w:pPr>
+            <w:r>
+              <w:rPr>
+                <w:sz w:val="19"/>
+                <w:szCs w:val="19"/>
+              </w:rPr>
               <w:t xml:space="preserve">A</w:t>
             </w:r>
           </w:p>
@@ -156,9 +174,14 @@
           </w:tcPr>
           <w:p>
             <w:pPr>
-              <w:spacing w:after="0"/>
-            </w:pPr>
-            <w:r>
+              <w:keepNext/>
+              <w:spacing w:after="0"/>
+            </w:pPr>
+            <w:r>
+              <w:rPr>
+                <w:sz w:val="19"/>
+                <w:szCs w:val="19"/>
+              </w:rPr>
               <w:t xml:space="preserve">Kebutuhan modal awal</w:t>
             </w:r>
           </w:p>
@@ -169,9 +192,14 @@
           </w:tcPr>
           <w:p>
             <w:pPr>
-              <w:spacing w:after="0"/>
-            </w:pPr>
-            <w:r>
+              <w:keepNext/>
+              <w:spacing w:after="0"/>
+            </w:pPr>
+            <w:r>
+              <w:rPr>
+                <w:sz w:val="19"/>
+                <w:szCs w:val="19"/>
+              </w:rPr>
               <w:t xml:space="preserve"/>
             </w:r>
           </w:p>
@@ -187,9 +215,14 @@
           </w:tcPr>
           <w:p>
             <w:pPr>
-              <w:spacing w:after="0"/>
-            </w:pPr>
-            <w:r>
+              <w:keepNext/>
+              <w:spacing w:after="0"/>
+            </w:pPr>
+            <w:r>
+              <w:rPr>
+                <w:sz w:val="19"/>
+                <w:szCs w:val="19"/>
+              </w:rPr>
               <w:t xml:space="preserve">B</w:t>
             </w:r>
           </w:p>
@@ -200,9 +233,14 @@
           </w:tcPr>
           <w:p>
             <w:pPr>
-              <w:spacing w:after="0"/>
-            </w:pPr>
-            <w:r>
+              <w:keepNext/>
+              <w:spacing w:after="0"/>
+            </w:pPr>
+            <w:r>
+              <w:rPr>
+                <w:sz w:val="19"/>
+                <w:szCs w:val="19"/>
+              </w:rPr>
               <w:t xml:space="preserve">Daya tawar pemasok</w:t>
             </w:r>
           </w:p>
@@ -213,9 +251,14 @@
           </w:tcPr>
           <w:p>
             <w:pPr>
-              <w:spacing w:after="0"/>
-            </w:pPr>
-            <w:r>
+              <w:keepNext/>
+              <w:spacing w:after="0"/>
+            </w:pPr>
+            <w:r>
+              <w:rPr>
+                <w:sz w:val="19"/>
+                <w:szCs w:val="19"/>
+              </w:rPr>
               <w:t xml:space="preserve"/>
             </w:r>
           </w:p>
@@ -231,9 +274,14 @@
           </w:tcPr>
           <w:p>
             <w:pPr>
-              <w:spacing w:after="0"/>
-            </w:pPr>
-            <w:r>
+              <w:keepNext/>
+              <w:spacing w:after="0"/>
+            </w:pPr>
+            <w:r>
+              <w:rPr>
+                <w:sz w:val="19"/>
+                <w:szCs w:val="19"/>
+              </w:rPr>
               <w:t xml:space="preserve">C</w:t>
             </w:r>
           </w:p>
@@ -244,9 +292,14 @@
           </w:tcPr>
           <w:p>
             <w:pPr>
-              <w:spacing w:after="0"/>
-            </w:pPr>
-            <w:r>
+              <w:keepNext/>
+              <w:spacing w:after="0"/>
+            </w:pPr>
+            <w:r>
+              <w:rPr>
+                <w:sz w:val="19"/>
+                <w:szCs w:val="19"/>
+              </w:rPr>
               <w:t xml:space="preserve">Hambatan masuk industri</w:t>
             </w:r>
           </w:p>
@@ -257,9 +310,14 @@
           </w:tcPr>
           <w:p>
             <w:pPr>
-              <w:spacing w:after="0"/>
-            </w:pPr>
-            <w:r>
+              <w:keepNext/>
+              <w:spacing w:after="0"/>
+            </w:pPr>
+            <w:r>
+              <w:rPr>
+                <w:sz w:val="19"/>
+                <w:szCs w:val="19"/>
+              </w:rPr>
               <w:t xml:space="preserve"/>
             </w:r>
           </w:p>
@@ -278,6 +336,10 @@
               <w:spacing w:after="0"/>
             </w:pPr>
             <w:r>
+              <w:rPr>
+                <w:sz w:val="19"/>
+                <w:szCs w:val="19"/>
+              </w:rPr>
               <w:t xml:space="preserve">D</w:t>
             </w:r>
           </w:p>
@@ -291,6 +353,10 @@
               <w:spacing w:after="0"/>
             </w:pPr>
             <w:r>
+              <w:rPr>
+                <w:sz w:val="19"/>
+                <w:szCs w:val="19"/>
+              </w:rPr>
               <w:t xml:space="preserve">Daya tawar pembeli</w:t>
             </w:r>
           </w:p>
@@ -308,6 +374,8 @@
               <w:rPr>
                 <w:b/>
                 <w:bCs/>
+                <w:sz w:val="19"/>
+                <w:szCs w:val="19"/>
               </w:rPr>
               <w:t xml:space="preserve">Kunci</w:t>
             </w:r>
@@ -385,13 +453,16 @@
     </w:p>
     <w:p>
       <w:pPr>
-        <w:pStyle w:val="Heading3"/>
+        <w:pStyle w:val="Heading2"/>
       </w:pPr>
       <w:r>
         <w:t xml:space="preserve">Soal 2 · Pilihan ganda · DEMO-MCQ-002</w:t>
       </w:r>
     </w:p>
     <w:p>
+      <w:pPr>
+        <w:keepNext/>
+      </w:pPr>
       <w:r>
         <w:t xml:space="preserve">[DEMO] PT Rasa Laut Lestari (fiktif) ingin meningkatkan loyalitas gerai ritel modern. Dalam strategy map, sasaran manakah yang paling tepat sebagai penggerak langsung sasaran tersebut?</w:t>
       </w:r>
@@ -418,6 +489,7 @@
       </w:tblGrid>
       <w:tr>
         <w:trPr>
+          <w:cantSplit/>
           <w:tblHeader/>
         </w:trPr>
         <w:tc>
@@ -427,12 +499,15 @@
           </w:tcPr>
           <w:p>
             <w:pPr>
+              <w:keepNext/>
               <w:spacing w:after="0"/>
             </w:pPr>
             <w:r>
               <w:rPr>
                 <w:b/>
                 <w:bCs/>
+                <w:sz w:val="19"/>
+                <w:szCs w:val="19"/>
               </w:rPr>
               <w:t xml:space="preserve">Opsi</w:t>
             </w:r>
@@ -445,12 +520,15 @@
           </w:tcPr>
           <w:p>
             <w:pPr>
+              <w:keepNext/>
               <w:spacing w:after="0"/>
             </w:pPr>
             <w:r>
               <w:rPr>
                 <w:b/>
                 <w:bCs/>
+                <w:sz w:val="19"/>
+                <w:szCs w:val="19"/>
               </w:rPr>
               <w:t xml:space="preserve">Teks</w:t>
             </w:r>
@@ -463,12 +541,15 @@
           </w:tcPr>
           <w:p>
             <w:pPr>
+              <w:keepNext/>
               <w:spacing w:after="0"/>
             </w:pPr>
             <w:r>
               <w:rPr>
                 <w:b/>
                 <w:bCs/>
+                <w:sz w:val="19"/>
+                <w:szCs w:val="19"/>
               </w:rPr>
               <w:t xml:space="preserve">Keterangan</w:t>
             </w:r>
@@ -485,9 +566,14 @@
           </w:tcPr>
           <w:p>
             <w:pPr>
-              <w:spacing w:after="0"/>
-            </w:pPr>
-            <w:r>
+              <w:keepNext/>
+              <w:spacing w:after="0"/>
+            </w:pPr>
+            <w:r>
+              <w:rPr>
+                <w:sz w:val="19"/>
+                <w:szCs w:val="19"/>
+              </w:rPr>
               <w:t xml:space="preserve">A</w:t>
             </w:r>
           </w:p>
@@ -498,9 +584,14 @@
           </w:tcPr>
           <w:p>
             <w:pPr>
-              <w:spacing w:after="0"/>
-            </w:pPr>
-            <w:r>
+              <w:keepNext/>
+              <w:spacing w:after="0"/>
+            </w:pPr>
+            <w:r>
+              <w:rPr>
+                <w:sz w:val="19"/>
+                <w:szCs w:val="19"/>
+              </w:rPr>
               <w:t xml:space="preserve">Meningkatkan kompetensi digital tenaga penjual</w:t>
             </w:r>
           </w:p>
@@ -511,9 +602,14 @@
           </w:tcPr>
           <w:p>
             <w:pPr>
-              <w:spacing w:after="0"/>
-            </w:pPr>
-            <w:r>
+              <w:keepNext/>
+              <w:spacing w:after="0"/>
+            </w:pPr>
+            <w:r>
+              <w:rPr>
+                <w:sz w:val="19"/>
+                <w:szCs w:val="19"/>
+              </w:rPr>
               <w:t xml:space="preserve"/>
             </w:r>
           </w:p>
@@ -529,9 +625,14 @@
           </w:tcPr>
           <w:p>
             <w:pPr>
-              <w:spacing w:after="0"/>
-            </w:pPr>
-            <w:r>
+              <w:keepNext/>
+              <w:spacing w:after="0"/>
+            </w:pPr>
+            <w:r>
+              <w:rPr>
+                <w:sz w:val="19"/>
+                <w:szCs w:val="19"/>
+              </w:rPr>
               <w:t xml:space="preserve">B</w:t>
             </w:r>
           </w:p>
@@ -542,9 +643,14 @@
           </w:tcPr>
           <w:p>
             <w:pPr>
-              <w:spacing w:after="0"/>
-            </w:pPr>
-            <w:r>
+              <w:keepNext/>
+              <w:spacing w:after="0"/>
+            </w:pPr>
+            <w:r>
+              <w:rPr>
+                <w:sz w:val="19"/>
+                <w:szCs w:val="19"/>
+              </w:rPr>
               <w:t xml:space="preserve">Menurunkan biaya produksi per kaleng 5%</w:t>
             </w:r>
           </w:p>
@@ -555,9 +661,14 @@
           </w:tcPr>
           <w:p>
             <w:pPr>
-              <w:spacing w:after="0"/>
-            </w:pPr>
-            <w:r>
+              <w:keepNext/>
+              <w:spacing w:after="0"/>
+            </w:pPr>
+            <w:r>
+              <w:rPr>
+                <w:sz w:val="19"/>
+                <w:szCs w:val="19"/>
+              </w:rPr>
               <w:t xml:space="preserve"/>
             </w:r>
           </w:p>
@@ -573,9 +684,14 @@
           </w:tcPr>
           <w:p>
             <w:pPr>
-              <w:spacing w:after="0"/>
-            </w:pPr>
-            <w:r>
+              <w:keepNext/>
+              <w:spacing w:after="0"/>
+            </w:pPr>
+            <w:r>
+              <w:rPr>
+                <w:sz w:val="19"/>
+                <w:szCs w:val="19"/>
+              </w:rPr>
               <w:t xml:space="preserve">C</w:t>
             </w:r>
           </w:p>
@@ -586,9 +702,14 @@
           </w:tcPr>
           <w:p>
             <w:pPr>
-              <w:spacing w:after="0"/>
-            </w:pPr>
-            <w:r>
+              <w:keepNext/>
+              <w:spacing w:after="0"/>
+            </w:pPr>
+            <w:r>
+              <w:rPr>
+                <w:sz w:val="19"/>
+                <w:szCs w:val="19"/>
+              </w:rPr>
               <w:t xml:space="preserve">Meningkatkan laba bersih per saham</w:t>
             </w:r>
           </w:p>
@@ -599,9 +720,14 @@
           </w:tcPr>
           <w:p>
             <w:pPr>
-              <w:spacing w:after="0"/>
-            </w:pPr>
-            <w:r>
+              <w:keepNext/>
+              <w:spacing w:after="0"/>
+            </w:pPr>
+            <w:r>
+              <w:rPr>
+                <w:sz w:val="19"/>
+                <w:szCs w:val="19"/>
+              </w:rPr>
               <w:t xml:space="preserve"/>
             </w:r>
           </w:p>
@@ -620,6 +746,10 @@
               <w:spacing w:after="0"/>
             </w:pPr>
             <w:r>
+              <w:rPr>
+                <w:sz w:val="19"/>
+                <w:szCs w:val="19"/>
+              </w:rPr>
               <w:t xml:space="preserve">D</w:t>
             </w:r>
           </w:p>
@@ -633,6 +763,10 @@
               <w:spacing w:after="0"/>
             </w:pPr>
             <w:r>
+              <w:rPr>
+                <w:sz w:val="19"/>
+                <w:szCs w:val="19"/>
+              </w:rPr>
               <w:t xml:space="preserve">Meningkatkan ketepatan waktu pengiriman ke gerai</w:t>
             </w:r>
           </w:p>
@@ -650,6 +784,8 @@
               <w:rPr>
                 <w:b/>
                 <w:bCs/>
+                <w:sz w:val="19"/>
+                <w:szCs w:val="19"/>
               </w:rPr>
               <w:t xml:space="preserve">Kunci</w:t>
             </w:r>
@@ -727,7 +863,7 @@
     </w:p>
     <w:p>
       <w:pPr>
-        <w:pStyle w:val="Heading3"/>
+        <w:pStyle w:val="Heading2"/>
       </w:pPr>
       <w:r>
         <w:t xml:space="preserve">Soal 3 · Numerik · DEMO-NUM-001</w:t>
@@ -838,7 +974,7 @@
     <w:tbl>
       <w:tblPr>
         <w:tblStyle w:val="TableGrid"/>
-        <w:tblW w:w="9635" w:type="dxa"/>
+        <w:tblW w:w="9637" w:type="dxa"/>
         <w:tblBorders>
           <w:top w:val="single" w:sz="4" w:space="0" w:color="8C96A3"/>
           <w:left w:val="single" w:sz="4" w:space="0" w:color="8C96A3"/>
@@ -851,28 +987,32 @@
         <w:tblLook w:val="04A0" w:firstRow="1" w:lastRow="0" w:firstColumn="0" w:lastColumn="0" w:noHBand="0" w:noVBand="1"/>
       </w:tblPr>
       <w:tblGrid>
-        <w:gridCol w:w="1070"/>
-        <w:gridCol w:w="1070"/>
-        <w:gridCol w:w="6425"/>
-        <w:gridCol w:w="1070"/>
+        <w:gridCol w:w="1068"/>
+        <w:gridCol w:w="1180"/>
+        <w:gridCol w:w="6325"/>
+        <w:gridCol w:w="1064"/>
       </w:tblGrid>
       <w:tr>
         <w:trPr>
+          <w:cantSplit/>
           <w:tblHeader/>
         </w:trPr>
         <w:tc>
           <w:tcPr>
-            <w:tcW w:w="1070" w:type="dxa"/>
+            <w:tcW w:w="1068" w:type="dxa"/>
             <w:shd w:val="clear" w:color="auto" w:fill="E7ECF3"/>
           </w:tcPr>
           <w:p>
             <w:pPr>
+              <w:keepNext/>
               <w:spacing w:after="0"/>
             </w:pPr>
             <w:r>
               <w:rPr>
                 <w:b/>
                 <w:bCs/>
+                <w:sz w:val="19"/>
+                <w:szCs w:val="19"/>
               </w:rPr>
               <w:t xml:space="preserve">Bagian</w:t>
             </w:r>
@@ -880,17 +1020,20 @@
         </w:tc>
         <w:tc>
           <w:tcPr>
-            <w:tcW w:w="1070" w:type="dxa"/>
+            <w:tcW w:w="1180" w:type="dxa"/>
             <w:shd w:val="clear" w:color="auto" w:fill="E7ECF3"/>
           </w:tcPr>
           <w:p>
             <w:pPr>
+              <w:keepNext/>
               <w:spacing w:after="0"/>
             </w:pPr>
             <w:r>
               <w:rPr>
                 <w:b/>
                 <w:bCs/>
+                <w:sz w:val="19"/>
+                <w:szCs w:val="19"/>
               </w:rPr>
               <w:t xml:space="preserve">Kriteria</w:t>
             </w:r>
@@ -898,17 +1041,20 @@
         </w:tc>
         <w:tc>
           <w:tcPr>
-            <w:tcW w:w="6425" w:type="dxa"/>
+            <w:tcW w:w="6325" w:type="dxa"/>
             <w:shd w:val="clear" w:color="auto" w:fill="E7ECF3"/>
           </w:tcPr>
           <w:p>
             <w:pPr>
+              <w:keepNext/>
               <w:spacing w:after="0"/>
             </w:pPr>
             <w:r>
               <w:rPr>
                 <w:b/>
                 <w:bCs/>
+                <w:sz w:val="19"/>
+                <w:szCs w:val="19"/>
               </w:rPr>
               <w:t xml:space="preserve">Deskripsi</w:t>
             </w:r>
@@ -916,17 +1062,20 @@
         </w:tc>
         <w:tc>
           <w:tcPr>
-            <w:tcW w:w="1070" w:type="dxa"/>
+            <w:tcW w:w="1064" w:type="dxa"/>
             <w:shd w:val="clear" w:color="auto" w:fill="E7ECF3"/>
           </w:tcPr>
           <w:p>
             <w:pPr>
+              <w:keepNext/>
               <w:spacing w:after="0"/>
             </w:pPr>
             <w:r>
               <w:rPr>
                 <w:b/>
                 <w:bCs/>
+                <w:sz w:val="19"/>
+                <w:szCs w:val="19"/>
               </w:rPr>
               <w:t xml:space="preserve">Maks</w:t>
             </w:r>
@@ -939,52 +1088,72 @@
         </w:trPr>
         <w:tc>
           <w:tcPr>
-            <w:tcW w:w="1070" w:type="dxa"/>
-          </w:tcPr>
-          <w:p>
-            <w:pPr>
-              <w:spacing w:after="0"/>
-            </w:pPr>
-            <w:r>
+            <w:tcW w:w="1068" w:type="dxa"/>
+          </w:tcPr>
+          <w:p>
+            <w:pPr>
+              <w:keepNext/>
+              <w:spacing w:after="0"/>
+            </w:pPr>
+            <w:r>
+              <w:rPr>
+                <w:sz w:val="19"/>
+                <w:szCs w:val="19"/>
+              </w:rPr>
               <w:t xml:space="preserve">—</w:t>
             </w:r>
           </w:p>
         </w:tc>
         <w:tc>
           <w:tcPr>
-            <w:tcW w:w="1070" w:type="dxa"/>
-          </w:tcPr>
-          <w:p>
-            <w:pPr>
-              <w:spacing w:after="0"/>
-            </w:pPr>
-            <w:r>
+            <w:tcW w:w="1180" w:type="dxa"/>
+          </w:tcPr>
+          <w:p>
+            <w:pPr>
+              <w:keepNext/>
+              <w:spacing w:after="0"/>
+            </w:pPr>
+            <w:r>
+              <w:rPr>
+                <w:sz w:val="19"/>
+                <w:szCs w:val="19"/>
+              </w:rPr>
               <w:t xml:space="preserve">C1</w:t>
             </w:r>
           </w:p>
         </w:tc>
         <w:tc>
           <w:tcPr>
-            <w:tcW w:w="6425" w:type="dxa"/>
-          </w:tcPr>
-          <w:p>
-            <w:pPr>
-              <w:spacing w:after="0"/>
-            </w:pPr>
-            <w:r>
+            <w:tcW w:w="6325" w:type="dxa"/>
+          </w:tcPr>
+          <w:p>
+            <w:pPr>
+              <w:keepNext/>
+              <w:spacing w:after="0"/>
+            </w:pPr>
+            <w:r>
+              <w:rPr>
+                <w:sz w:val="19"/>
+                <w:szCs w:val="19"/>
+              </w:rPr>
               <w:t xml:space="preserve">Kelemahan ukuran keuangan semata</w:t>
             </w:r>
           </w:p>
         </w:tc>
         <w:tc>
           <w:tcPr>
-            <w:tcW w:w="1070" w:type="dxa"/>
-          </w:tcPr>
-          <w:p>
-            <w:pPr>
-              <w:spacing w:after="0"/>
-            </w:pPr>
-            <w:r>
+            <w:tcW w:w="1064" w:type="dxa"/>
+          </w:tcPr>
+          <w:p>
+            <w:pPr>
+              <w:keepNext/>
+              <w:spacing w:after="0"/>
+            </w:pPr>
+            <w:r>
+              <w:rPr>
+                <w:sz w:val="19"/>
+                <w:szCs w:val="19"/>
+              </w:rPr>
               <w:t xml:space="preserve">3,00</w:t>
             </w:r>
           </w:p>
@@ -996,52 +1165,72 @@
         </w:trPr>
         <w:tc>
           <w:tcPr>
-            <w:tcW w:w="1070" w:type="dxa"/>
-          </w:tcPr>
-          <w:p>
-            <w:pPr>
-              <w:spacing w:after="0"/>
-            </w:pPr>
-            <w:r>
+            <w:tcW w:w="1068" w:type="dxa"/>
+          </w:tcPr>
+          <w:p>
+            <w:pPr>
+              <w:keepNext/>
+              <w:spacing w:after="0"/>
+            </w:pPr>
+            <w:r>
+              <w:rPr>
+                <w:sz w:val="19"/>
+                <w:szCs w:val="19"/>
+              </w:rPr>
               <w:t xml:space="preserve">—</w:t>
             </w:r>
           </w:p>
         </w:tc>
         <w:tc>
           <w:tcPr>
-            <w:tcW w:w="1070" w:type="dxa"/>
-          </w:tcPr>
-          <w:p>
-            <w:pPr>
-              <w:spacing w:after="0"/>
-            </w:pPr>
-            <w:r>
+            <w:tcW w:w="1180" w:type="dxa"/>
+          </w:tcPr>
+          <w:p>
+            <w:pPr>
+              <w:keepNext/>
+              <w:spacing w:after="0"/>
+            </w:pPr>
+            <w:r>
+              <w:rPr>
+                <w:sz w:val="19"/>
+                <w:szCs w:val="19"/>
+              </w:rPr>
               <w:t xml:space="preserve">C2</w:t>
             </w:r>
           </w:p>
         </w:tc>
         <w:tc>
           <w:tcPr>
-            <w:tcW w:w="6425" w:type="dxa"/>
-          </w:tcPr>
-          <w:p>
-            <w:pPr>
-              <w:spacing w:after="0"/>
-            </w:pPr>
-            <w:r>
+            <w:tcW w:w="6325" w:type="dxa"/>
+          </w:tcPr>
+          <w:p>
+            <w:pPr>
+              <w:keepNext/>
+              <w:spacing w:after="0"/>
+            </w:pPr>
+            <w:r>
+              <w:rPr>
+                <w:sz w:val="19"/>
+                <w:szCs w:val="19"/>
+              </w:rPr>
               <w:t xml:space="preserve">Logika balanced scorecard</w:t>
             </w:r>
           </w:p>
         </w:tc>
         <w:tc>
           <w:tcPr>
-            <w:tcW w:w="1070" w:type="dxa"/>
-          </w:tcPr>
-          <w:p>
-            <w:pPr>
-              <w:spacing w:after="0"/>
-            </w:pPr>
-            <w:r>
+            <w:tcW w:w="1064" w:type="dxa"/>
+          </w:tcPr>
+          <w:p>
+            <w:pPr>
+              <w:keepNext/>
+              <w:spacing w:after="0"/>
+            </w:pPr>
+            <w:r>
+              <w:rPr>
+                <w:sz w:val="19"/>
+                <w:szCs w:val="19"/>
+              </w:rPr>
               <w:t xml:space="preserve">3,00</w:t>
             </w:r>
           </w:p>
@@ -1053,52 +1242,72 @@
         </w:trPr>
         <w:tc>
           <w:tcPr>
-            <w:tcW w:w="1070" w:type="dxa"/>
-          </w:tcPr>
-          <w:p>
-            <w:pPr>
-              <w:spacing w:after="0"/>
-            </w:pPr>
-            <w:r>
+            <w:tcW w:w="1068" w:type="dxa"/>
+          </w:tcPr>
+          <w:p>
+            <w:pPr>
+              <w:keepNext/>
+              <w:spacing w:after="0"/>
+            </w:pPr>
+            <w:r>
+              <w:rPr>
+                <w:sz w:val="19"/>
+                <w:szCs w:val="19"/>
+              </w:rPr>
               <w:t xml:space="preserve">—</w:t>
             </w:r>
           </w:p>
         </w:tc>
         <w:tc>
           <w:tcPr>
-            <w:tcW w:w="1070" w:type="dxa"/>
-          </w:tcPr>
-          <w:p>
-            <w:pPr>
-              <w:spacing w:after="0"/>
-            </w:pPr>
-            <w:r>
+            <w:tcW w:w="1180" w:type="dxa"/>
+          </w:tcPr>
+          <w:p>
+            <w:pPr>
+              <w:keepNext/>
+              <w:spacing w:after="0"/>
+            </w:pPr>
+            <w:r>
+              <w:rPr>
+                <w:sz w:val="19"/>
+                <w:szCs w:val="19"/>
+              </w:rPr>
               <w:t xml:space="preserve">C3</w:t>
             </w:r>
           </w:p>
         </w:tc>
         <w:tc>
           <w:tcPr>
-            <w:tcW w:w="6425" w:type="dxa"/>
-          </w:tcPr>
-          <w:p>
-            <w:pPr>
-              <w:spacing w:after="0"/>
-            </w:pPr>
-            <w:r>
+            <w:tcW w:w="6325" w:type="dxa"/>
+          </w:tcPr>
+          <w:p>
+            <w:pPr>
+              <w:keepNext/>
+              <w:spacing w:after="0"/>
+            </w:pPr>
+            <w:r>
+              <w:rPr>
+                <w:sz w:val="19"/>
+                <w:szCs w:val="19"/>
+              </w:rPr>
               <w:t xml:space="preserve">Contoh ukuran per perspektif</w:t>
             </w:r>
           </w:p>
         </w:tc>
         <w:tc>
           <w:tcPr>
-            <w:tcW w:w="1070" w:type="dxa"/>
-          </w:tcPr>
-          <w:p>
-            <w:pPr>
-              <w:spacing w:after="0"/>
-            </w:pPr>
-            <w:r>
+            <w:tcW w:w="1064" w:type="dxa"/>
+          </w:tcPr>
+          <w:p>
+            <w:pPr>
+              <w:keepNext/>
+              <w:spacing w:after="0"/>
+            </w:pPr>
+            <w:r>
+              <w:rPr>
+                <w:sz w:val="19"/>
+                <w:szCs w:val="19"/>
+              </w:rPr>
               <w:t xml:space="preserve">2,00</w:t>
             </w:r>
           </w:p>
@@ -1110,52 +1319,68 @@
         </w:trPr>
         <w:tc>
           <w:tcPr>
-            <w:tcW w:w="1070" w:type="dxa"/>
-          </w:tcPr>
-          <w:p>
-            <w:pPr>
-              <w:spacing w:after="0"/>
-            </w:pPr>
-            <w:r>
+            <w:tcW w:w="1068" w:type="dxa"/>
+          </w:tcPr>
+          <w:p>
+            <w:pPr>
+              <w:spacing w:after="0"/>
+            </w:pPr>
+            <w:r>
+              <w:rPr>
+                <w:sz w:val="19"/>
+                <w:szCs w:val="19"/>
+              </w:rPr>
               <w:t xml:space="preserve">—</w:t>
             </w:r>
           </w:p>
         </w:tc>
         <w:tc>
           <w:tcPr>
-            <w:tcW w:w="1070" w:type="dxa"/>
-          </w:tcPr>
-          <w:p>
-            <w:pPr>
-              <w:spacing w:after="0"/>
-            </w:pPr>
-            <w:r>
+            <w:tcW w:w="1180" w:type="dxa"/>
+          </w:tcPr>
+          <w:p>
+            <w:pPr>
+              <w:spacing w:after="0"/>
+            </w:pPr>
+            <w:r>
+              <w:rPr>
+                <w:sz w:val="19"/>
+                <w:szCs w:val="19"/>
+              </w:rPr>
               <w:t xml:space="preserve">C4</w:t>
             </w:r>
           </w:p>
         </w:tc>
         <w:tc>
           <w:tcPr>
-            <w:tcW w:w="6425" w:type="dxa"/>
-          </w:tcPr>
-          <w:p>
-            <w:pPr>
-              <w:spacing w:after="0"/>
-            </w:pPr>
-            <w:r>
+            <w:tcW w:w="6325" w:type="dxa"/>
+          </w:tcPr>
+          <w:p>
+            <w:pPr>
+              <w:spacing w:after="0"/>
+            </w:pPr>
+            <w:r>
+              <w:rPr>
+                <w:sz w:val="19"/>
+                <w:szCs w:val="19"/>
+              </w:rPr>
               <w:t xml:space="preserve">Kualitas argumentasi</w:t>
             </w:r>
           </w:p>
         </w:tc>
         <w:tc>
           <w:tcPr>
-            <w:tcW w:w="1070" w:type="dxa"/>
-          </w:tcPr>
-          <w:p>
-            <w:pPr>
-              <w:spacing w:after="0"/>
-            </w:pPr>
-            <w:r>
+            <w:tcW w:w="1064" w:type="dxa"/>
+          </w:tcPr>
+          <w:p>
+            <w:pPr>
+              <w:spacing w:after="0"/>
+            </w:pPr>
+            <w:r>
+              <w:rPr>
+                <w:sz w:val="19"/>
+                <w:szCs w:val="19"/>
+              </w:rPr>
               <w:t xml:space="preserve">2,00</w:t>
             </w:r>
           </w:p>
@@ -1205,6 +1430,9 @@
       </w:r>
     </w:p>
     <w:p>
+      <w:pPr>
+        <w:keepNext/>
+      </w:pPr>
       <w:r>
         <w:rPr>
           <w:b/>
@@ -1236,6 +1464,7 @@
       </w:tblGrid>
       <w:tr>
         <w:trPr>
+          <w:cantSplit/>
           <w:tblHeader/>
         </w:trPr>
         <w:tc>
@@ -1245,12 +1474,15 @@
           </w:tcPr>
           <w:p>
             <w:pPr>
+              <w:keepNext/>
               <w:spacing w:after="0"/>
             </w:pPr>
             <w:r>
               <w:rPr>
                 <w:b/>
                 <w:bCs/>
+                <w:sz w:val="19"/>
+                <w:szCs w:val="19"/>
               </w:rPr>
               <w:t xml:space="preserve">Segmen</w:t>
             </w:r>
@@ -1263,12 +1495,15 @@
           </w:tcPr>
           <w:p>
             <w:pPr>
+              <w:keepNext/>
               <w:spacing w:after="0"/>
             </w:pPr>
             <w:r>
               <w:rPr>
                 <w:b/>
                 <w:bCs/>
+                <w:sz w:val="19"/>
+                <w:szCs w:val="19"/>
               </w:rPr>
               <w:t xml:space="preserve">Pendapatan</w:t>
             </w:r>
@@ -1281,12 +1516,15 @@
           </w:tcPr>
           <w:p>
             <w:pPr>
+              <w:keepNext/>
               <w:spacing w:after="0"/>
             </w:pPr>
             <w:r>
               <w:rPr>
                 <w:b/>
                 <w:bCs/>
+                <w:sz w:val="19"/>
+                <w:szCs w:val="19"/>
               </w:rPr>
               <w:t xml:space="preserve">Laba operasi</w:t>
             </w:r>
@@ -1299,12 +1537,15 @@
           </w:tcPr>
           <w:p>
             <w:pPr>
+              <w:keepNext/>
               <w:spacing w:after="0"/>
             </w:pPr>
             <w:r>
               <w:rPr>
                 <w:b/>
                 <w:bCs/>
+                <w:sz w:val="19"/>
+                <w:szCs w:val="19"/>
               </w:rPr>
               <w:t xml:space="preserve">Margin operasi (%)</w:t>
             </w:r>
@@ -1321,9 +1562,14 @@
           </w:tcPr>
           <w:p>
             <w:pPr>
-              <w:spacing w:after="0"/>
-            </w:pPr>
-            <w:r>
+              <w:keepNext/>
+              <w:spacing w:after="0"/>
+            </w:pPr>
+            <w:r>
+              <w:rPr>
+                <w:sz w:val="19"/>
+                <w:szCs w:val="19"/>
+              </w:rPr>
               <w:t xml:space="preserve">Pengiriman B2B</w:t>
             </w:r>
           </w:p>
@@ -1334,9 +1580,14 @@
           </w:tcPr>
           <w:p>
             <w:pPr>
-              <w:spacing w:after="0"/>
-            </w:pPr>
-            <w:r>
+              <w:keepNext/>
+              <w:spacing w:after="0"/>
+            </w:pPr>
+            <w:r>
+              <w:rPr>
+                <w:sz w:val="19"/>
+                <w:szCs w:val="19"/>
+              </w:rPr>
               <w:t xml:space="preserve">820</w:t>
             </w:r>
           </w:p>
@@ -1347,9 +1598,14 @@
           </w:tcPr>
           <w:p>
             <w:pPr>
-              <w:spacing w:after="0"/>
-            </w:pPr>
-            <w:r>
+              <w:keepNext/>
+              <w:spacing w:after="0"/>
+            </w:pPr>
+            <w:r>
+              <w:rPr>
+                <w:sz w:val="19"/>
+                <w:szCs w:val="19"/>
+              </w:rPr>
               <w:t xml:space="preserve">98,4</w:t>
             </w:r>
           </w:p>
@@ -1360,9 +1616,14 @@
           </w:tcPr>
           <w:p>
             <w:pPr>
-              <w:spacing w:after="0"/>
-            </w:pPr>
-            <w:r>
+              <w:keepNext/>
+              <w:spacing w:after="0"/>
+            </w:pPr>
+            <w:r>
+              <w:rPr>
+                <w:sz w:val="19"/>
+                <w:szCs w:val="19"/>
+              </w:rPr>
               <w:t xml:space="preserve">12</w:t>
             </w:r>
           </w:p>
@@ -1378,9 +1639,14 @@
           </w:tcPr>
           <w:p>
             <w:pPr>
-              <w:spacing w:after="0"/>
-            </w:pPr>
-            <w:r>
+              <w:keepNext/>
+              <w:spacing w:after="0"/>
+            </w:pPr>
+            <w:r>
+              <w:rPr>
+                <w:sz w:val="19"/>
+                <w:szCs w:val="19"/>
+              </w:rPr>
               <w:t xml:space="preserve">Pengiriman ritel</w:t>
             </w:r>
           </w:p>
@@ -1391,9 +1657,14 @@
           </w:tcPr>
           <w:p>
             <w:pPr>
-              <w:spacing w:after="0"/>
-            </w:pPr>
-            <w:r>
+              <w:keepNext/>
+              <w:spacing w:after="0"/>
+            </w:pPr>
+            <w:r>
+              <w:rPr>
+                <w:sz w:val="19"/>
+                <w:szCs w:val="19"/>
+              </w:rPr>
               <w:t xml:space="preserve">430</w:t>
             </w:r>
           </w:p>
@@ -1404,9 +1675,14 @@
           </w:tcPr>
           <w:p>
             <w:pPr>
-              <w:spacing w:after="0"/>
-            </w:pPr>
-            <w:r>
+              <w:keepNext/>
+              <w:spacing w:after="0"/>
+            </w:pPr>
+            <w:r>
+              <w:rPr>
+                <w:sz w:val="19"/>
+                <w:szCs w:val="19"/>
+              </w:rPr>
               <w:t xml:space="preserve">21,5</w:t>
             </w:r>
           </w:p>
@@ -1417,9 +1693,14 @@
           </w:tcPr>
           <w:p>
             <w:pPr>
-              <w:spacing w:after="0"/>
-            </w:pPr>
-            <w:r>
+              <w:keepNext/>
+              <w:spacing w:after="0"/>
+            </w:pPr>
+            <w:r>
+              <w:rPr>
+                <w:sz w:val="19"/>
+                <w:szCs w:val="19"/>
+              </w:rPr>
               <w:t xml:space="preserve">5</w:t>
             </w:r>
           </w:p>
@@ -1435,9 +1716,14 @@
           </w:tcPr>
           <w:p>
             <w:pPr>
-              <w:spacing w:after="0"/>
-            </w:pPr>
-            <w:r>
+              <w:keepNext/>
+              <w:spacing w:after="0"/>
+            </w:pPr>
+            <w:r>
+              <w:rPr>
+                <w:sz w:val="19"/>
+                <w:szCs w:val="19"/>
+              </w:rPr>
               <w:t xml:space="preserve">Pergudangan</w:t>
             </w:r>
           </w:p>
@@ -1448,9 +1734,14 @@
           </w:tcPr>
           <w:p>
             <w:pPr>
-              <w:spacing w:after="0"/>
-            </w:pPr>
-            <w:r>
+              <w:keepNext/>
+              <w:spacing w:after="0"/>
+            </w:pPr>
+            <w:r>
+              <w:rPr>
+                <w:sz w:val="19"/>
+                <w:szCs w:val="19"/>
+              </w:rPr>
               <w:t xml:space="preserve">250</w:t>
             </w:r>
           </w:p>
@@ -1461,9 +1752,14 @@
           </w:tcPr>
           <w:p>
             <w:pPr>
-              <w:spacing w:after="0"/>
-            </w:pPr>
-            <w:r>
+              <w:keepNext/>
+              <w:spacing w:after="0"/>
+            </w:pPr>
+            <w:r>
+              <w:rPr>
+                <w:sz w:val="19"/>
+                <w:szCs w:val="19"/>
+              </w:rPr>
               <w:t xml:space="preserve">37,5</w:t>
             </w:r>
           </w:p>
@@ -1474,9 +1770,14 @@
           </w:tcPr>
           <w:p>
             <w:pPr>
-              <w:spacing w:after="0"/>
-            </w:pPr>
-            <w:r>
+              <w:keepNext/>
+              <w:spacing w:after="0"/>
+            </w:pPr>
+            <w:r>
+              <w:rPr>
+                <w:sz w:val="19"/>
+                <w:szCs w:val="19"/>
+              </w:rPr>
               <w:t xml:space="preserve">15</w:t>
             </w:r>
           </w:p>
@@ -1495,6 +1796,10 @@
               <w:spacing w:after="0"/>
             </w:pPr>
             <w:r>
+              <w:rPr>
+                <w:sz w:val="19"/>
+                <w:szCs w:val="19"/>
+              </w:rPr>
               <w:t xml:space="preserve">Total</w:t>
             </w:r>
           </w:p>
@@ -1508,6 +1813,10 @@
               <w:spacing w:after="0"/>
             </w:pPr>
             <w:r>
+              <w:rPr>
+                <w:sz w:val="19"/>
+                <w:szCs w:val="19"/>
+              </w:rPr>
               <w:t xml:space="preserve">1.500</w:t>
             </w:r>
           </w:p>
@@ -1521,6 +1830,10 @@
               <w:spacing w:after="0"/>
             </w:pPr>
             <w:r>
+              <w:rPr>
+                <w:sz w:val="19"/>
+                <w:szCs w:val="19"/>
+              </w:rPr>
               <w:t xml:space="preserve">157,4</w:t>
             </w:r>
           </w:p>
@@ -1534,6 +1847,10 @@
               <w:spacing w:after="0"/>
             </w:pPr>
             <w:r>
+              <w:rPr>
+                <w:sz w:val="19"/>
+                <w:szCs w:val="19"/>
+              </w:rPr>
               <w:t xml:space="preserve">10,49</w:t>
             </w:r>
           </w:p>
@@ -1614,7 +1931,7 @@
         <w:t xml:space="preserve">Alternatif yang dapat diterima: </w:t>
       </w:r>
       <w:r>
-        <w:t xml:space="preserve">Rekomendasi pilihan (1) dapat nilai penuh pada C3 bila argumennya kuat dan risikonya dianalisis. Kerangka GE-McKinsey, BCG, atau Porter boleh dipakai.</w:t>
+        <w:t xml:space="preserve">Rekomendasi pilihan (1) dapat nilai penuh pada (b) C3 bila argumennya kuat dan risikonya dianalisis. Kerangka GE-McKinsey, BCG, atau Porter boleh dipakai.</w:t>
       </w:r>
     </w:p>
     <w:p>
@@ -1628,7 +1945,7 @@
     <w:tbl>
       <w:tblPr>
         <w:tblStyle w:val="TableGrid"/>
-        <w:tblW w:w="9635" w:type="dxa"/>
+        <w:tblW w:w="9637" w:type="dxa"/>
         <w:tblBorders>
           <w:top w:val="single" w:sz="4" w:space="0" w:color="8C96A3"/>
           <w:left w:val="single" w:sz="4" w:space="0" w:color="8C96A3"/>
@@ -1641,28 +1958,32 @@
         <w:tblLook w:val="04A0" w:firstRow="1" w:lastRow="0" w:firstColumn="0" w:lastColumn="0" w:noHBand="0" w:noVBand="1"/>
       </w:tblPr>
       <w:tblGrid>
-        <w:gridCol w:w="1070"/>
-        <w:gridCol w:w="1070"/>
-        <w:gridCol w:w="6425"/>
-        <w:gridCol w:w="1070"/>
+        <w:gridCol w:w="1068"/>
+        <w:gridCol w:w="1180"/>
+        <w:gridCol w:w="6325"/>
+        <w:gridCol w:w="1064"/>
       </w:tblGrid>
       <w:tr>
         <w:trPr>
+          <w:cantSplit/>
           <w:tblHeader/>
         </w:trPr>
         <w:tc>
           <w:tcPr>
-            <w:tcW w:w="1070" w:type="dxa"/>
+            <w:tcW w:w="1068" w:type="dxa"/>
             <w:shd w:val="clear" w:color="auto" w:fill="E7ECF3"/>
           </w:tcPr>
           <w:p>
             <w:pPr>
+              <w:keepNext/>
               <w:spacing w:after="0"/>
             </w:pPr>
             <w:r>
               <w:rPr>
                 <w:b/>
                 <w:bCs/>
+                <w:sz w:val="19"/>
+                <w:szCs w:val="19"/>
               </w:rPr>
               <w:t xml:space="preserve">Bagian</w:t>
             </w:r>
@@ -1670,17 +1991,20 @@
         </w:tc>
         <w:tc>
           <w:tcPr>
-            <w:tcW w:w="1070" w:type="dxa"/>
+            <w:tcW w:w="1180" w:type="dxa"/>
             <w:shd w:val="clear" w:color="auto" w:fill="E7ECF3"/>
           </w:tcPr>
           <w:p>
             <w:pPr>
+              <w:keepNext/>
               <w:spacing w:after="0"/>
             </w:pPr>
             <w:r>
               <w:rPr>
                 <w:b/>
                 <w:bCs/>
+                <w:sz w:val="19"/>
+                <w:szCs w:val="19"/>
               </w:rPr>
               <w:t xml:space="preserve">Kriteria</w:t>
             </w:r>
@@ -1688,17 +2012,20 @@
         </w:tc>
         <w:tc>
           <w:tcPr>
-            <w:tcW w:w="6425" w:type="dxa"/>
+            <w:tcW w:w="6325" w:type="dxa"/>
             <w:shd w:val="clear" w:color="auto" w:fill="E7ECF3"/>
           </w:tcPr>
           <w:p>
             <w:pPr>
+              <w:keepNext/>
               <w:spacing w:after="0"/>
             </w:pPr>
             <w:r>
               <w:rPr>
                 <w:b/>
                 <w:bCs/>
+                <w:sz w:val="19"/>
+                <w:szCs w:val="19"/>
               </w:rPr>
               <w:t xml:space="preserve">Deskripsi</w:t>
             </w:r>
@@ -1706,17 +2033,20 @@
         </w:tc>
         <w:tc>
           <w:tcPr>
-            <w:tcW w:w="1070" w:type="dxa"/>
+            <w:tcW w:w="1064" w:type="dxa"/>
             <w:shd w:val="clear" w:color="auto" w:fill="E7ECF3"/>
           </w:tcPr>
           <w:p>
             <w:pPr>
+              <w:keepNext/>
               <w:spacing w:after="0"/>
             </w:pPr>
             <w:r>
               <w:rPr>
                 <w:b/>
                 <w:bCs/>
+                <w:sz w:val="19"/>
+                <w:szCs w:val="19"/>
               </w:rPr>
               <w:t xml:space="preserve">Maks</w:t>
             </w:r>
@@ -1729,52 +2059,72 @@
         </w:trPr>
         <w:tc>
           <w:tcPr>
-            <w:tcW w:w="1070" w:type="dxa"/>
-          </w:tcPr>
-          <w:p>
-            <w:pPr>
-              <w:spacing w:after="0"/>
-            </w:pPr>
-            <w:r>
+            <w:tcW w:w="1068" w:type="dxa"/>
+          </w:tcPr>
+          <w:p>
+            <w:pPr>
+              <w:keepNext/>
+              <w:spacing w:after="0"/>
+            </w:pPr>
+            <w:r>
+              <w:rPr>
+                <w:sz w:val="19"/>
+                <w:szCs w:val="19"/>
+              </w:rPr>
               <w:t xml:space="preserve">(a)</w:t>
             </w:r>
           </w:p>
         </w:tc>
         <w:tc>
           <w:tcPr>
-            <w:tcW w:w="1070" w:type="dxa"/>
-          </w:tcPr>
-          <w:p>
-            <w:pPr>
-              <w:spacing w:after="0"/>
-            </w:pPr>
-            <w:r>
+            <w:tcW w:w="1180" w:type="dxa"/>
+          </w:tcPr>
+          <w:p>
+            <w:pPr>
+              <w:keepNext/>
+              <w:spacing w:after="0"/>
+            </w:pPr>
+            <w:r>
+              <w:rPr>
+                <w:sz w:val="19"/>
+                <w:szCs w:val="19"/>
+              </w:rPr>
               <w:t xml:space="preserve">C1</w:t>
             </w:r>
           </w:p>
         </w:tc>
         <w:tc>
           <w:tcPr>
-            <w:tcW w:w="6425" w:type="dxa"/>
-          </w:tcPr>
-          <w:p>
-            <w:pPr>
-              <w:spacing w:after="0"/>
-            </w:pPr>
-            <w:r>
+            <w:tcW w:w="6325" w:type="dxa"/>
+          </w:tcPr>
+          <w:p>
+            <w:pPr>
+              <w:keepNext/>
+              <w:spacing w:after="0"/>
+            </w:pPr>
+            <w:r>
+              <w:rPr>
+                <w:sz w:val="19"/>
+                <w:szCs w:val="19"/>
+              </w:rPr>
               <w:t xml:space="preserve">Membaca data margin dan kontribusi laba</w:t>
             </w:r>
           </w:p>
         </w:tc>
         <w:tc>
           <w:tcPr>
-            <w:tcW w:w="1070" w:type="dxa"/>
-          </w:tcPr>
-          <w:p>
-            <w:pPr>
-              <w:spacing w:after="0"/>
-            </w:pPr>
-            <w:r>
+            <w:tcW w:w="1064" w:type="dxa"/>
+          </w:tcPr>
+          <w:p>
+            <w:pPr>
+              <w:keepNext/>
+              <w:spacing w:after="0"/>
+            </w:pPr>
+            <w:r>
+              <w:rPr>
+                <w:sz w:val="19"/>
+                <w:szCs w:val="19"/>
+              </w:rPr>
               <w:t xml:space="preserve">3,00</w:t>
             </w:r>
           </w:p>
@@ -1786,52 +2136,72 @@
         </w:trPr>
         <w:tc>
           <w:tcPr>
-            <w:tcW w:w="1070" w:type="dxa"/>
-          </w:tcPr>
-          <w:p>
-            <w:pPr>
-              <w:spacing w:after="0"/>
-            </w:pPr>
-            <w:r>
+            <w:tcW w:w="1068" w:type="dxa"/>
+          </w:tcPr>
+          <w:p>
+            <w:pPr>
+              <w:keepNext/>
+              <w:spacing w:after="0"/>
+            </w:pPr>
+            <w:r>
+              <w:rPr>
+                <w:sz w:val="19"/>
+                <w:szCs w:val="19"/>
+              </w:rPr>
               <w:t xml:space="preserve">(a)</w:t>
             </w:r>
           </w:p>
         </w:tc>
         <w:tc>
           <w:tcPr>
-            <w:tcW w:w="1070" w:type="dxa"/>
-          </w:tcPr>
-          <w:p>
-            <w:pPr>
-              <w:spacing w:after="0"/>
-            </w:pPr>
-            <w:r>
+            <w:tcW w:w="1180" w:type="dxa"/>
+          </w:tcPr>
+          <w:p>
+            <w:pPr>
+              <w:keepNext/>
+              <w:spacing w:after="0"/>
+            </w:pPr>
+            <w:r>
+              <w:rPr>
+                <w:sz w:val="19"/>
+                <w:szCs w:val="19"/>
+              </w:rPr>
               <w:t xml:space="preserve">C2</w:t>
             </w:r>
           </w:p>
         </w:tc>
         <w:tc>
           <w:tcPr>
-            <w:tcW w:w="6425" w:type="dxa"/>
-          </w:tcPr>
-          <w:p>
-            <w:pPr>
-              <w:spacing w:after="0"/>
-            </w:pPr>
-            <w:r>
+            <w:tcW w:w="6325" w:type="dxa"/>
+          </w:tcPr>
+          <w:p>
+            <w:pPr>
+              <w:keepNext/>
+              <w:spacing w:after="0"/>
+            </w:pPr>
+            <w:r>
+              <w:rPr>
+                <w:sz w:val="19"/>
+                <w:szCs w:val="19"/>
+              </w:rPr>
               <w:t xml:space="preserve">Mengaitkan data dengan persaingan</w:t>
             </w:r>
           </w:p>
         </w:tc>
         <w:tc>
           <w:tcPr>
-            <w:tcW w:w="1070" w:type="dxa"/>
-          </w:tcPr>
-          <w:p>
-            <w:pPr>
-              <w:spacing w:after="0"/>
-            </w:pPr>
-            <w:r>
+            <w:tcW w:w="1064" w:type="dxa"/>
+          </w:tcPr>
+          <w:p>
+            <w:pPr>
+              <w:keepNext/>
+              <w:spacing w:after="0"/>
+            </w:pPr>
+            <w:r>
+              <w:rPr>
+                <w:sz w:val="19"/>
+                <w:szCs w:val="19"/>
+              </w:rPr>
               <w:t xml:space="preserve">3,00</w:t>
             </w:r>
           </w:p>
@@ -1843,52 +2213,72 @@
         </w:trPr>
         <w:tc>
           <w:tcPr>
-            <w:tcW w:w="1070" w:type="dxa"/>
-          </w:tcPr>
-          <w:p>
-            <w:pPr>
-              <w:spacing w:after="0"/>
-            </w:pPr>
-            <w:r>
+            <w:tcW w:w="1068" w:type="dxa"/>
+          </w:tcPr>
+          <w:p>
+            <w:pPr>
+              <w:keepNext/>
+              <w:spacing w:after="0"/>
+            </w:pPr>
+            <w:r>
+              <w:rPr>
+                <w:sz w:val="19"/>
+                <w:szCs w:val="19"/>
+              </w:rPr>
               <w:t xml:space="preserve">(a)</w:t>
             </w:r>
           </w:p>
         </w:tc>
         <w:tc>
           <w:tcPr>
-            <w:tcW w:w="1070" w:type="dxa"/>
-          </w:tcPr>
-          <w:p>
-            <w:pPr>
-              <w:spacing w:after="0"/>
-            </w:pPr>
-            <w:r>
+            <w:tcW w:w="1180" w:type="dxa"/>
+          </w:tcPr>
+          <w:p>
+            <w:pPr>
+              <w:keepNext/>
+              <w:spacing w:after="0"/>
+            </w:pPr>
+            <w:r>
+              <w:rPr>
+                <w:sz w:val="19"/>
+                <w:szCs w:val="19"/>
+              </w:rPr>
               <w:t xml:space="preserve">C3</w:t>
             </w:r>
           </w:p>
         </w:tc>
         <w:tc>
           <w:tcPr>
-            <w:tcW w:w="6425" w:type="dxa"/>
-          </w:tcPr>
-          <w:p>
-            <w:pPr>
-              <w:spacing w:after="0"/>
-            </w:pPr>
-            <w:r>
+            <w:tcW w:w="6325" w:type="dxa"/>
+          </w:tcPr>
+          <w:p>
+            <w:pPr>
+              <w:keepNext/>
+              <w:spacing w:after="0"/>
+            </w:pPr>
+            <w:r>
+              <w:rPr>
+                <w:sz w:val="19"/>
+                <w:szCs w:val="19"/>
+              </w:rPr>
               <w:t xml:space="preserve">Kesimpulan posisi segmen</w:t>
             </w:r>
           </w:p>
         </w:tc>
         <w:tc>
           <w:tcPr>
-            <w:tcW w:w="1070" w:type="dxa"/>
-          </w:tcPr>
-          <w:p>
-            <w:pPr>
-              <w:spacing w:after="0"/>
-            </w:pPr>
-            <w:r>
+            <w:tcW w:w="1064" w:type="dxa"/>
+          </w:tcPr>
+          <w:p>
+            <w:pPr>
+              <w:keepNext/>
+              <w:spacing w:after="0"/>
+            </w:pPr>
+            <w:r>
+              <w:rPr>
+                <w:sz w:val="19"/>
+                <w:szCs w:val="19"/>
+              </w:rPr>
               <w:t xml:space="preserve">2,00</w:t>
             </w:r>
           </w:p>
@@ -1900,52 +2290,72 @@
         </w:trPr>
         <w:tc>
           <w:tcPr>
-            <w:tcW w:w="1070" w:type="dxa"/>
-          </w:tcPr>
-          <w:p>
-            <w:pPr>
-              <w:spacing w:after="0"/>
-            </w:pPr>
-            <w:r>
+            <w:tcW w:w="1068" w:type="dxa"/>
+          </w:tcPr>
+          <w:p>
+            <w:pPr>
+              <w:keepNext/>
+              <w:spacing w:after="0"/>
+            </w:pPr>
+            <w:r>
+              <w:rPr>
+                <w:sz w:val="19"/>
+                <w:szCs w:val="19"/>
+              </w:rPr>
               <w:t xml:space="preserve">(b)</w:t>
             </w:r>
           </w:p>
         </w:tc>
         <w:tc>
           <w:tcPr>
-            <w:tcW w:w="1070" w:type="dxa"/>
-          </w:tcPr>
-          <w:p>
-            <w:pPr>
-              <w:spacing w:after="0"/>
-            </w:pPr>
-            <w:r>
+            <w:tcW w:w="1180" w:type="dxa"/>
+          </w:tcPr>
+          <w:p>
+            <w:pPr>
+              <w:keepNext/>
+              <w:spacing w:after="0"/>
+            </w:pPr>
+            <w:r>
+              <w:rPr>
+                <w:sz w:val="19"/>
+                <w:szCs w:val="19"/>
+              </w:rPr>
               <w:t xml:space="preserve">C1</w:t>
             </w:r>
           </w:p>
         </w:tc>
         <w:tc>
           <w:tcPr>
-            <w:tcW w:w="6425" w:type="dxa"/>
-          </w:tcPr>
-          <w:p>
-            <w:pPr>
-              <w:spacing w:after="0"/>
-            </w:pPr>
-            <w:r>
+            <w:tcW w:w="6325" w:type="dxa"/>
+          </w:tcPr>
+          <w:p>
+            <w:pPr>
+              <w:keepNext/>
+              <w:spacing w:after="0"/>
+            </w:pPr>
+            <w:r>
+              <w:rPr>
+                <w:sz w:val="19"/>
+                <w:szCs w:val="19"/>
+              </w:rPr>
               <w:t xml:space="preserve">Evaluasi pilihan (1)</w:t>
             </w:r>
           </w:p>
         </w:tc>
         <w:tc>
           <w:tcPr>
-            <w:tcW w:w="1070" w:type="dxa"/>
-          </w:tcPr>
-          <w:p>
-            <w:pPr>
-              <w:spacing w:after="0"/>
-            </w:pPr>
-            <w:r>
+            <w:tcW w:w="1064" w:type="dxa"/>
+          </w:tcPr>
+          <w:p>
+            <w:pPr>
+              <w:keepNext/>
+              <w:spacing w:after="0"/>
+            </w:pPr>
+            <w:r>
+              <w:rPr>
+                <w:sz w:val="19"/>
+                <w:szCs w:val="19"/>
+              </w:rPr>
               <w:t xml:space="preserve">4,00</w:t>
             </w:r>
           </w:p>
@@ -1957,52 +2367,72 @@
         </w:trPr>
         <w:tc>
           <w:tcPr>
-            <w:tcW w:w="1070" w:type="dxa"/>
-          </w:tcPr>
-          <w:p>
-            <w:pPr>
-              <w:spacing w:after="0"/>
-            </w:pPr>
-            <w:r>
+            <w:tcW w:w="1068" w:type="dxa"/>
+          </w:tcPr>
+          <w:p>
+            <w:pPr>
+              <w:keepNext/>
+              <w:spacing w:after="0"/>
+            </w:pPr>
+            <w:r>
+              <w:rPr>
+                <w:sz w:val="19"/>
+                <w:szCs w:val="19"/>
+              </w:rPr>
               <w:t xml:space="preserve">(b)</w:t>
             </w:r>
           </w:p>
         </w:tc>
         <w:tc>
           <w:tcPr>
-            <w:tcW w:w="1070" w:type="dxa"/>
-          </w:tcPr>
-          <w:p>
-            <w:pPr>
-              <w:spacing w:after="0"/>
-            </w:pPr>
-            <w:r>
+            <w:tcW w:w="1180" w:type="dxa"/>
+          </w:tcPr>
+          <w:p>
+            <w:pPr>
+              <w:keepNext/>
+              <w:spacing w:after="0"/>
+            </w:pPr>
+            <w:r>
+              <w:rPr>
+                <w:sz w:val="19"/>
+                <w:szCs w:val="19"/>
+              </w:rPr>
               <w:t xml:space="preserve">C2</w:t>
             </w:r>
           </w:p>
         </w:tc>
         <w:tc>
           <w:tcPr>
-            <w:tcW w:w="6425" w:type="dxa"/>
-          </w:tcPr>
-          <w:p>
-            <w:pPr>
-              <w:spacing w:after="0"/>
-            </w:pPr>
-            <w:r>
+            <w:tcW w:w="6325" w:type="dxa"/>
+          </w:tcPr>
+          <w:p>
+            <w:pPr>
+              <w:keepNext/>
+              <w:spacing w:after="0"/>
+            </w:pPr>
+            <w:r>
+              <w:rPr>
+                <w:sz w:val="19"/>
+                <w:szCs w:val="19"/>
+              </w:rPr>
               <w:t xml:space="preserve">Evaluasi pilihan (2)</w:t>
             </w:r>
           </w:p>
         </w:tc>
         <w:tc>
           <w:tcPr>
-            <w:tcW w:w="1070" w:type="dxa"/>
-          </w:tcPr>
-          <w:p>
-            <w:pPr>
-              <w:spacing w:after="0"/>
-            </w:pPr>
-            <w:r>
+            <w:tcW w:w="1064" w:type="dxa"/>
+          </w:tcPr>
+          <w:p>
+            <w:pPr>
+              <w:keepNext/>
+              <w:spacing w:after="0"/>
+            </w:pPr>
+            <w:r>
+              <w:rPr>
+                <w:sz w:val="19"/>
+                <w:szCs w:val="19"/>
+              </w:rPr>
               <w:t xml:space="preserve">4,00</w:t>
             </w:r>
           </w:p>
@@ -2014,52 +2444,72 @@
         </w:trPr>
         <w:tc>
           <w:tcPr>
-            <w:tcW w:w="1070" w:type="dxa"/>
-          </w:tcPr>
-          <w:p>
-            <w:pPr>
-              <w:spacing w:after="0"/>
-            </w:pPr>
-            <w:r>
+            <w:tcW w:w="1068" w:type="dxa"/>
+          </w:tcPr>
+          <w:p>
+            <w:pPr>
+              <w:keepNext/>
+              <w:spacing w:after="0"/>
+            </w:pPr>
+            <w:r>
+              <w:rPr>
+                <w:sz w:val="19"/>
+                <w:szCs w:val="19"/>
+              </w:rPr>
               <w:t xml:space="preserve">(b)</w:t>
             </w:r>
           </w:p>
         </w:tc>
         <w:tc>
           <w:tcPr>
-            <w:tcW w:w="1070" w:type="dxa"/>
-          </w:tcPr>
-          <w:p>
-            <w:pPr>
-              <w:spacing w:after="0"/>
-            </w:pPr>
-            <w:r>
+            <w:tcW w:w="1180" w:type="dxa"/>
+          </w:tcPr>
+          <w:p>
+            <w:pPr>
+              <w:keepNext/>
+              <w:spacing w:after="0"/>
+            </w:pPr>
+            <w:r>
+              <w:rPr>
+                <w:sz w:val="19"/>
+                <w:szCs w:val="19"/>
+              </w:rPr>
               <w:t xml:space="preserve">C3</w:t>
             </w:r>
           </w:p>
         </w:tc>
         <w:tc>
           <w:tcPr>
-            <w:tcW w:w="6425" w:type="dxa"/>
-          </w:tcPr>
-          <w:p>
-            <w:pPr>
-              <w:spacing w:after="0"/>
-            </w:pPr>
-            <w:r>
+            <w:tcW w:w="6325" w:type="dxa"/>
+          </w:tcPr>
+          <w:p>
+            <w:pPr>
+              <w:keepNext/>
+              <w:spacing w:after="0"/>
+            </w:pPr>
+            <w:r>
+              <w:rPr>
+                <w:sz w:val="19"/>
+                <w:szCs w:val="19"/>
+              </w:rPr>
               <w:t xml:space="preserve">Rekomendasi</w:t>
             </w:r>
           </w:p>
         </w:tc>
         <w:tc>
           <w:tcPr>
-            <w:tcW w:w="1070" w:type="dxa"/>
-          </w:tcPr>
-          <w:p>
-            <w:pPr>
-              <w:spacing w:after="0"/>
-            </w:pPr>
-            <w:r>
+            <w:tcW w:w="1064" w:type="dxa"/>
+          </w:tcPr>
+          <w:p>
+            <w:pPr>
+              <w:keepNext/>
+              <w:spacing w:after="0"/>
+            </w:pPr>
+            <w:r>
+              <w:rPr>
+                <w:sz w:val="19"/>
+                <w:szCs w:val="19"/>
+              </w:rPr>
               <w:t xml:space="preserve">2,00</w:t>
             </w:r>
           </w:p>
@@ -2071,52 +2521,68 @@
         </w:trPr>
         <w:tc>
           <w:tcPr>
-            <w:tcW w:w="1070" w:type="dxa"/>
-          </w:tcPr>
-          <w:p>
-            <w:pPr>
-              <w:spacing w:after="0"/>
-            </w:pPr>
-            <w:r>
+            <w:tcW w:w="1068" w:type="dxa"/>
+          </w:tcPr>
+          <w:p>
+            <w:pPr>
+              <w:spacing w:after="0"/>
+            </w:pPr>
+            <w:r>
+              <w:rPr>
+                <w:sz w:val="19"/>
+                <w:szCs w:val="19"/>
+              </w:rPr>
               <w:t xml:space="preserve">(b)</w:t>
             </w:r>
           </w:p>
         </w:tc>
         <w:tc>
           <w:tcPr>
-            <w:tcW w:w="1070" w:type="dxa"/>
-          </w:tcPr>
-          <w:p>
-            <w:pPr>
-              <w:spacing w:after="0"/>
-            </w:pPr>
-            <w:r>
+            <w:tcW w:w="1180" w:type="dxa"/>
+          </w:tcPr>
+          <w:p>
+            <w:pPr>
+              <w:spacing w:after="0"/>
+            </w:pPr>
+            <w:r>
+              <w:rPr>
+                <w:sz w:val="19"/>
+                <w:szCs w:val="19"/>
+              </w:rPr>
               <w:t xml:space="preserve">C4</w:t>
             </w:r>
           </w:p>
         </w:tc>
         <w:tc>
           <w:tcPr>
-            <w:tcW w:w="6425" w:type="dxa"/>
-          </w:tcPr>
-          <w:p>
-            <w:pPr>
-              <w:spacing w:after="0"/>
-            </w:pPr>
-            <w:r>
+            <w:tcW w:w="6325" w:type="dxa"/>
+          </w:tcPr>
+          <w:p>
+            <w:pPr>
+              <w:spacing w:after="0"/>
+            </w:pPr>
+            <w:r>
+              <w:rPr>
+                <w:sz w:val="19"/>
+                <w:szCs w:val="19"/>
+              </w:rPr>
               <w:t xml:space="preserve">Risiko dan mitigasi</w:t>
             </w:r>
           </w:p>
         </w:tc>
         <w:tc>
           <w:tcPr>
-            <w:tcW w:w="1070" w:type="dxa"/>
-          </w:tcPr>
-          <w:p>
-            <w:pPr>
-              <w:spacing w:after="0"/>
-            </w:pPr>
-            <w:r>
+            <w:tcW w:w="1064" w:type="dxa"/>
+          </w:tcPr>
+          <w:p>
+            <w:pPr>
+              <w:spacing w:after="0"/>
+            </w:pPr>
+            <w:r>
+              <w:rPr>
+                <w:sz w:val="19"/>
+                <w:szCs w:val="19"/>
+              </w:rPr>
               <w:t xml:space="preserve">2,00</w:t>
             </w:r>
           </w:p>
@@ -2129,11 +2595,58 @@
       </w:pPr>
     </w:p>
     <w:sectPr>
+      <w:footerReference w:type="default" r:id="rId2"/>
       <w:pgSz w:w="11906" w:h="16838"/>
       <w:pgMar w:top="1134" w:right="1134" w:bottom="1134" w:left="1134" w:header="567" w:footer="567" w:gutter="0"/>
     </w:sectPr>
   </w:body>
 </w:document>
+</file>
+
+<file path=word/footer1.xml><?xml version="1.0" encoding="utf-8"?>
+<w:ftr xmlns:w="http://schemas.openxmlformats.org/wordprocessingml/2006/main" xmlns:r="http://schemas.openxmlformats.org/officeDocument/2006/relationships">
+  <w:p>
+    <w:pPr>
+      <w:jc w:val="center"/>
+    </w:pPr>
+    <w:r>
+      <w:rPr>
+        <w:color w:val="555E6B"/>
+        <w:sz w:val="16"/>
+        <w:szCs w:val="16"/>
+      </w:rPr>
+      <w:t xml:space="preserve">Lembar Belajar · ID sesi demo-20261017-99d81897 · Halaman </w:t>
+    </w:r>
+    <w:fldSimple w:instr=" PAGE ">
+      <w:r>
+        <w:rPr>
+          <w:color w:val="555E6B"/>
+          <w:sz w:val="16"/>
+          <w:szCs w:val="16"/>
+        </w:rPr>
+        <w:t xml:space="preserve">1</w:t>
+      </w:r>
+    </w:fldSimple>
+    <w:r>
+      <w:rPr>
+        <w:color w:val="555E6B"/>
+        <w:sz w:val="16"/>
+        <w:szCs w:val="16"/>
+      </w:rPr>
+      <w:t xml:space="preserve"> dari </w:t>
+    </w:r>
+    <w:fldSimple w:instr=" NUMPAGES ">
+      <w:r>
+        <w:rPr>
+          <w:color w:val="555E6B"/>
+          <w:sz w:val="16"/>
+          <w:szCs w:val="16"/>
+        </w:rPr>
+        <w:t xml:space="preserve">1</w:t>
+      </w:r>
+    </w:fldSimple>
+  </w:p>
+</w:ftr>
 </file>
 
 <file path=word/styles.xml><?xml version="1.0" encoding="utf-8"?>

</xml_diff>